<commit_message>
Refresh FIAKeyTerms data for 2026-09-23 release
</commit_message>
<xml_diff>
--- a/arb/docx/002.content.docx
+++ b/arb/docx/002.content.docx
@@ -405,20 +405,15 @@
         </w:rPr>
         <w:t xml:space="preserve">وعندما آمن </w:t>
       </w:r>
-      <w:hyperlink r:id="rId13">
-        <w:r>
-          <w:rPr>
-            <w:rtl/>
-            <w:cs/>
-            <w:lang w:val="ar_AE" w:bidi="ar_AE"/>
-          </w:rPr>
-          <w:rPr>
-            <w:color w:val="0000EE"/>
-            <w:u w:val="single"/>
-          </w:rPr>
-          <w:t>إبراهيم</w:t>
-        </w:r>
-      </w:hyperlink>
+      <w:r>
+        <w:rPr>
+          <w:b/>
+          <w:rtl/>
+          <w:cs/>
+          <w:lang w:val="ar_AE" w:bidi="ar_AE"/>
+        </w:rPr>
+        <w:t>إبراهيم</w:t>
+      </w:r>
       <w:r>
         <w:rPr>
           <w:rtl/>
@@ -638,20 +633,14 @@
         </w:rPr>
         <w:t xml:space="preserve">وعلى الرغم من أن العديد من ترجمات الكتاب المُقدَّس تستخدم كلمة جزام (برص) أو أبرص، فإن هذا المرض لم يكن موجودًا في </w:t>
       </w:r>
-      <w:hyperlink r:id="rId14">
-        <w:r>
-          <w:rPr>
-            <w:rtl/>
-            <w:cs/>
-            <w:lang w:val="ar_AE" w:bidi="ar_AE"/>
-          </w:rPr>
-          <w:rPr>
-            <w:color w:val="0000EE"/>
-            <w:u w:val="single"/>
-          </w:rPr>
-          <w:t>إسرائيل</w:t>
-        </w:r>
-      </w:hyperlink>
+      <w:r>
+        <w:rPr>
+          <w:rtl/>
+          <w:cs/>
+          <w:lang w:val="ar_AE" w:bidi="ar_AE"/>
+        </w:rPr>
+        <w:t>إسرائيل</w:t>
+      </w:r>
       <w:r>
         <w:rPr>
           <w:rtl/>
@@ -682,7 +671,6 @@
       </w:r>
       <w:r>
         <w:rPr>
-          <w:b/>
           <w:rtl/>
           <w:cs/>
           <w:lang w:val="ar_AE" w:bidi="ar_AE"/>
@@ -697,20 +685,14 @@
         </w:rPr>
         <w:t xml:space="preserve">" - وهذا يعني أن هذا الشخص لم يَعُد لائقًا أو مقبولًا كي </w:t>
       </w:r>
-      <w:hyperlink r:id="rId15">
-        <w:r>
-          <w:rPr>
-            <w:rtl/>
-            <w:cs/>
-            <w:lang w:val="ar_AE" w:bidi="ar_AE"/>
-          </w:rPr>
-          <w:rPr>
-            <w:color w:val="0000EE"/>
-            <w:u w:val="single"/>
-          </w:rPr>
-          <w:t>يعبد</w:t>
-        </w:r>
-      </w:hyperlink>
+      <w:r>
+        <w:rPr>
+          <w:rtl/>
+          <w:cs/>
+          <w:lang w:val="ar_AE" w:bidi="ar_AE"/>
+        </w:rPr>
+        <w:t>يعبد</w:t>
+      </w:r>
       <w:r>
         <w:rPr>
           <w:rtl/>
@@ -739,20 +721,14 @@
         </w:rPr>
         <w:t xml:space="preserve">ربما لم يكن المرض نفسه معديًا، لكن المرض كان تذكيرًا للناس بكيفية انتشار </w:t>
       </w:r>
-      <w:hyperlink r:id="rId16">
-        <w:r>
-          <w:rPr>
-            <w:rtl/>
-            <w:cs/>
-            <w:lang w:val="ar_AE" w:bidi="ar_AE"/>
-          </w:rPr>
-          <w:rPr>
-            <w:color w:val="0000EE"/>
-            <w:u w:val="single"/>
-          </w:rPr>
-          <w:t>الخطية</w:t>
-        </w:r>
-      </w:hyperlink>
+      <w:r>
+        <w:rPr>
+          <w:rtl/>
+          <w:cs/>
+          <w:lang w:val="ar_AE" w:bidi="ar_AE"/>
+        </w:rPr>
+        <w:t>الخطية</w:t>
+      </w:r>
       <w:r>
         <w:rPr>
           <w:rtl/>
@@ -801,20 +777,14 @@
         </w:rPr>
         <w:t xml:space="preserve">وعندما كان شخص ما يلاحظ بقعة غريبة على جسده، كان عليه أن يذهب إلى </w:t>
       </w:r>
-      <w:hyperlink r:id="rId17">
-        <w:r>
-          <w:rPr>
-            <w:rtl/>
-            <w:cs/>
-            <w:lang w:val="ar_AE" w:bidi="ar_AE"/>
-          </w:rPr>
-          <w:rPr>
-            <w:color w:val="0000EE"/>
-            <w:u w:val="single"/>
-          </w:rPr>
-          <w:t>الكاهن</w:t>
-        </w:r>
-      </w:hyperlink>
+      <w:r>
+        <w:rPr>
+          <w:rtl/>
+          <w:cs/>
+          <w:lang w:val="ar_AE" w:bidi="ar_AE"/>
+        </w:rPr>
+        <w:t>الكاهن</w:t>
+      </w:r>
       <w:r>
         <w:rPr>
           <w:rtl/>
@@ -823,20 +793,14 @@
         </w:rPr>
         <w:t xml:space="preserve">. فالكهنة هم الأشخاص العاملون في </w:t>
       </w:r>
-      <w:hyperlink r:id="rId18">
-        <w:r>
-          <w:rPr>
-            <w:rtl/>
-            <w:cs/>
-            <w:lang w:val="ar_AE" w:bidi="ar_AE"/>
-          </w:rPr>
-          <w:rPr>
-            <w:color w:val="0000EE"/>
-            <w:u w:val="single"/>
-          </w:rPr>
-          <w:t>هيكل</w:t>
-        </w:r>
-      </w:hyperlink>
+      <w:r>
+        <w:rPr>
+          <w:rtl/>
+          <w:cs/>
+          <w:lang w:val="ar_AE" w:bidi="ar_AE"/>
+        </w:rPr>
+        <w:t>هيكل</w:t>
+      </w:r>
       <w:r>
         <w:rPr>
           <w:rtl/>
@@ -845,20 +809,14 @@
         </w:rPr>
         <w:t xml:space="preserve"> الله. كما كان الكهنة مسؤولين عن التأكد من أن الناس كانوا طاهرين من الناحية الطقسية: كان الكهنة يقومون بالطقوس التي تجعل الناس لائقين لعبادة الله. ولذلك، كان على الكهنة أن يقرّروا ما إذا كان الشخص الذي عنده بقعة على جسده طاهرًا أم لا. وقد حدد الله وصايا وتوجيهات في </w:t>
       </w:r>
-      <w:hyperlink r:id="rId19">
-        <w:r>
-          <w:rPr>
-            <w:rtl/>
-            <w:cs/>
-            <w:lang w:val="ar_AE" w:bidi="ar_AE"/>
-          </w:rPr>
-          <w:rPr>
-            <w:color w:val="0000EE"/>
-            <w:u w:val="single"/>
-          </w:rPr>
-          <w:t>شريعته</w:t>
-        </w:r>
-      </w:hyperlink>
+      <w:r>
+        <w:rPr>
+          <w:rtl/>
+          <w:cs/>
+          <w:lang w:val="ar_AE" w:bidi="ar_AE"/>
+        </w:rPr>
+        <w:t>شريعته</w:t>
+      </w:r>
       <w:r>
         <w:rPr>
           <w:rtl/>
@@ -926,20 +884,14 @@
           <w:lang w:val="ar_AE" w:bidi="ar_AE"/>
         </w:rPr>
       </w:r>
-      <w:hyperlink r:id="rId20">
-        <w:r>
-          <w:rPr>
-            <w:rtl/>
-            <w:cs/>
-            <w:lang w:val="ar_AE" w:bidi="ar_AE"/>
-          </w:rPr>
-          <w:rPr>
-            <w:color w:val="0000EE"/>
-            <w:u w:val="single"/>
-          </w:rPr>
-          <w:t>الصحراء</w:t>
-        </w:r>
-      </w:hyperlink>
+      <w:r>
+        <w:rPr>
+          <w:rtl/>
+          <w:cs/>
+          <w:lang w:val="ar_AE" w:bidi="ar_AE"/>
+        </w:rPr>
+        <w:t>الصحراء</w:t>
+      </w:r>
       <w:r>
         <w:rPr>
           <w:rtl/>
@@ -1041,20 +993,14 @@
         </w:rPr>
         <w:t xml:space="preserve"> هو بحر، أو بحيرة، في شمال </w:t>
       </w:r>
-      <w:hyperlink r:id="rId14">
-        <w:r>
-          <w:rPr>
-            <w:rtl/>
-            <w:cs/>
-            <w:lang w:val="ar_AE" w:bidi="ar_AE"/>
-          </w:rPr>
-          <w:rPr>
-            <w:color w:val="0000EE"/>
-            <w:u w:val="single"/>
-          </w:rPr>
-          <w:t>إسرائيل</w:t>
-        </w:r>
-      </w:hyperlink>
+      <w:r>
+        <w:rPr>
+          <w:rtl/>
+          <w:cs/>
+          <w:lang w:val="ar_AE" w:bidi="ar_AE"/>
+        </w:rPr>
+        <w:t>إسرائيل</w:t>
+      </w:r>
       <w:r>
         <w:rPr>
           <w:rtl/>
@@ -1063,20 +1009,14 @@
         </w:rPr>
         <w:t xml:space="preserve">. وفي العهد الجديد، فإن الجزء من البلاد الذي يقع بالقرب من بحر الجليل كان يُدعى </w:t>
       </w:r>
-      <w:hyperlink r:id="rId21">
-        <w:r>
-          <w:rPr>
-            <w:rtl/>
-            <w:cs/>
-            <w:lang w:val="ar_AE" w:bidi="ar_AE"/>
-          </w:rPr>
-          <w:rPr>
-            <w:color w:val="0000EE"/>
-            <w:u w:val="single"/>
-          </w:rPr>
-          <w:t>الجليل</w:t>
-        </w:r>
-      </w:hyperlink>
+      <w:r>
+        <w:rPr>
+          <w:rtl/>
+          <w:cs/>
+          <w:lang w:val="ar_AE" w:bidi="ar_AE"/>
+        </w:rPr>
+        <w:t>الجليل</w:t>
+      </w:r>
       <w:r>
         <w:rPr>
           <w:rtl/>
@@ -1127,7 +1067,6 @@
       </w:r>
       <w:r>
         <w:rPr>
-          <w:b/>
           <w:rtl/>
           <w:cs/>
           <w:lang w:val="ar_AE" w:bidi="ar_AE"/>
@@ -1248,7 +1187,6 @@
       </w:r>
       <w:r>
         <w:rPr>
-          <w:b/>
           <w:rtl/>
           <w:cs/>
           <w:lang w:val="ar_AE" w:bidi="ar_AE"/>
@@ -1339,20 +1277,14 @@
         </w:rPr>
         <w:t xml:space="preserve"> هو مكان داخل </w:t>
       </w:r>
-      <w:hyperlink r:id="rId22">
-        <w:r>
-          <w:rPr>
-            <w:rtl/>
-            <w:cs/>
-            <w:lang w:val="ar_AE" w:bidi="ar_AE"/>
-          </w:rPr>
-          <w:rPr>
-            <w:color w:val="0000EE"/>
-            <w:u w:val="single"/>
-          </w:rPr>
-          <w:t>الكرم</w:t>
-        </w:r>
-      </w:hyperlink>
+      <w:r>
+        <w:rPr>
+          <w:rtl/>
+          <w:cs/>
+          <w:lang w:val="ar_AE" w:bidi="ar_AE"/>
+        </w:rPr>
+        <w:t>الكرم</w:t>
+      </w:r>
       <w:r>
         <w:rPr>
           <w:rtl/>
@@ -1484,20 +1416,112 @@
       </w:r>
       <w:r>
         <w:rPr>
+          <w:rtl/>
+          <w:cs/>
+          <w:lang w:val="ar_AE" w:bidi="ar_AE"/>
+        </w:rPr>
+        <w:t>يصلِّي</w:t>
+      </w:r>
+      <w:r>
+        <w:rPr>
+          <w:rtl/>
+          <w:cs/>
+          <w:lang w:val="ar_AE" w:bidi="ar_AE"/>
+        </w:rPr>
+        <w:t xml:space="preserve"> أن يفعل الله أشياءً صالحة لهذا الشخص الآخر.</w:t>
+      </w:r>
+    </w:p>
+    <w:p>
+      <w:pPr>
+        <w:bidi/>
+      </w:pPr>
+      <w:r>
+        <w:rPr>
+          <w:rtl/>
+          <w:cs/>
+          <w:lang w:val="ar_AE" w:bidi="ar_AE"/>
+        </w:rPr>
+      </w:r>
+      <w:r>
+        <w:rPr>
+          <w:rtl/>
+          <w:cs/>
+          <w:lang w:val="ar_AE" w:bidi="ar_AE"/>
+        </w:rPr>
+        <w:t xml:space="preserve">وحين يبارك الناس الله، فإن هذا يعني أنهم </w:t>
+      </w:r>
+      <w:r>
+        <w:rPr>
+          <w:rtl/>
+          <w:cs/>
+          <w:lang w:val="ar_AE" w:bidi="ar_AE"/>
+        </w:rPr>
+        <w:t>يعبدون</w:t>
+      </w:r>
+      <w:r>
+        <w:rPr>
+          <w:rtl/>
+          <w:cs/>
+          <w:lang w:val="ar_AE" w:bidi="ar_AE"/>
+        </w:rPr>
+        <w:t xml:space="preserve"> الله ويشكرونه على خيره وبركاته.</w:t>
+      </w:r>
+    </w:p>
+    <w:p>
+      <w:pPr>
+        <w:bidi/>
+      </w:pPr>
+      <w:r>
+        <w:rPr>
+          <w:rtl/>
+          <w:cs/>
+          <w:lang w:val="ar_AE" w:bidi="ar_AE"/>
+        </w:rPr>
+      </w:r>
+      <w:r>
+        <w:rPr>
+          <w:rtl/>
+          <w:cs/>
+          <w:lang w:val="ar_AE" w:bidi="ar_AE"/>
+        </w:rPr>
+        <w:t>وعندما يبارك الناس شيئًا - على سبيل المثال الطعام، فإن هذا يعني أنهم يشكرون الله على ذلك الشيء.</w:t>
+      </w:r>
+    </w:p>
+    <w:p>
+      <w:pPr>
+        <w:bidi/>
+      </w:pPr>
+      <w:r>
+        <w:rPr>
+          <w:rtl/>
+          <w:cs/>
+          <w:lang w:val="ar_AE" w:bidi="ar_AE"/>
+        </w:rPr>
+      </w:r>
+      <w:r>
+        <w:rPr>
+          <w:rtl/>
+          <w:cs/>
+          <w:lang w:val="ar_AE" w:bidi="ar_AE"/>
+        </w:rPr>
+        <w:t xml:space="preserve">وعندما تدعون شخصًا ما </w:t>
+      </w:r>
+      <w:r>
+        <w:rPr>
           <w:b/>
           <w:rtl/>
           <w:cs/>
           <w:lang w:val="ar_AE" w:bidi="ar_AE"/>
         </w:rPr>
-        <w:t>يصلِّي</w:t>
-      </w:r>
-      <w:r>
-        <w:rPr>
-          <w:rtl/>
-          <w:cs/>
-          <w:lang w:val="ar_AE" w:bidi="ar_AE"/>
-        </w:rPr>
-        <w:t xml:space="preserve"> أن يفعل الله أشياءً صالحة لهذا الشخص الآخر.</w:t>
+        <w:t>مباركًا</w:t>
+      </w:r>
+      <w:r>
+        <w:rPr>
+          <w:rtl/>
+          <w:cs/>
+          <w:lang w:val="ar_AE" w:bidi="ar_AE"/>
+        </w:rPr>
+        <w:t>، فإنكم تقولون إن الآخرين يستطيعون أن يهنئوا ذلك الشخص. ويمكن للآخرين أن يفرحوا لهؤلاء الناس، لأن الله قد باركهم.</w:t>
       </w:r>
     </w:p>
     <w:p>
@@ -1517,116 +1541,16 @@
           <w:cs/>
           <w:lang w:val="ar_AE" w:bidi="ar_AE"/>
         </w:rPr>
-        <w:t xml:space="preserve">وحين يبارك الناس الله، فإن هذا يعني أنهم </w:t>
-      </w:r>
-      <w:r>
-        <w:rPr>
-          <w:b/>
-          <w:rtl/>
-          <w:cs/>
-          <w:lang w:val="ar_AE" w:bidi="ar_AE"/>
-        </w:rPr>
-        <w:t>يعبدون</w:t>
-      </w:r>
-      <w:r>
-        <w:rPr>
-          <w:rtl/>
-          <w:cs/>
-          <w:lang w:val="ar_AE" w:bidi="ar_AE"/>
-        </w:rPr>
-        <w:t xml:space="preserve"> الله ويشكرونه على خيره وبركاته.</w:t>
-      </w:r>
-    </w:p>
-    <w:p>
-      <w:pPr>
-        <w:bidi/>
-      </w:pPr>
-      <w:r>
-        <w:rPr>
-          <w:rtl/>
-          <w:cs/>
-          <w:lang w:val="ar_AE" w:bidi="ar_AE"/>
-        </w:rPr>
-      </w:r>
-      <w:r>
-        <w:rPr>
-          <w:rtl/>
-          <w:cs/>
-          <w:lang w:val="ar_AE" w:bidi="ar_AE"/>
-        </w:rPr>
-        <w:t>وعندما يبارك الناس شيئًا - على سبيل المثال الطعام، فإن هذا يعني أنهم يشكرون الله على ذلك الشيء.</w:t>
-      </w:r>
-    </w:p>
-    <w:p>
-      <w:pPr>
-        <w:bidi/>
-      </w:pPr>
-      <w:r>
-        <w:rPr>
-          <w:rtl/>
-          <w:cs/>
-          <w:lang w:val="ar_AE" w:bidi="ar_AE"/>
-        </w:rPr>
-      </w:r>
-      <w:r>
-        <w:rPr>
-          <w:rtl/>
-          <w:cs/>
-          <w:lang w:val="ar_AE" w:bidi="ar_AE"/>
-        </w:rPr>
-        <w:t xml:space="preserve">وعندما تدعون شخصًا ما </w:t>
-      </w:r>
-      <w:r>
-        <w:rPr>
-          <w:b/>
-          <w:rtl/>
-          <w:cs/>
-          <w:lang w:val="ar_AE" w:bidi="ar_AE"/>
-        </w:rPr>
-        <w:t>مباركًا</w:t>
-      </w:r>
-      <w:r>
-        <w:rPr>
-          <w:rtl/>
-          <w:cs/>
-          <w:lang w:val="ar_AE" w:bidi="ar_AE"/>
-        </w:rPr>
-        <w:t>، فإنكم تقولون إن الآخرين يستطيعون أن يهنئوا ذلك الشخص. ويمكن للآخرين أن يفرحوا لهؤلاء الناس، لأن الله قد باركهم.</w:t>
-      </w:r>
-    </w:p>
-    <w:p>
-      <w:pPr>
-        <w:bidi/>
-      </w:pPr>
-      <w:r>
-        <w:rPr>
-          <w:rtl/>
-          <w:cs/>
-          <w:lang w:val="ar_AE" w:bidi="ar_AE"/>
-        </w:rPr>
-      </w:r>
-      <w:r>
-        <w:rPr>
-          <w:rtl/>
-          <w:cs/>
-          <w:lang w:val="ar_AE" w:bidi="ar_AE"/>
-        </w:rPr>
         <w:t xml:space="preserve">ومقابل البركة هي </w:t>
       </w:r>
-      <w:hyperlink r:id="rId23">
-        <w:r>
-          <w:rPr>
-            <w:rtl/>
-            <w:cs/>
-            <w:lang w:val="ar_AE" w:bidi="ar_AE"/>
-          </w:rPr>
-          <w:rPr>
-            <w:color w:val="0000EE"/>
-            <w:u w:val="single"/>
-          </w:rPr>
-          <w:t>اللعنة</w:t>
-        </w:r>
-      </w:hyperlink>
+      <w:r>
+        <w:rPr>
+          <w:rtl/>
+          <w:cs/>
+          <w:lang w:val="ar_AE" w:bidi="ar_AE"/>
+        </w:rPr>
+        <w:t>اللعنة</w:t>
+      </w:r>
       <w:r>
         <w:rPr>
           <w:rtl/>
@@ -1637,7 +1561,6 @@
       </w:r>
       <w:r>
         <w:rPr>
-          <w:b/>
           <w:rtl/>
           <w:cs/>
           <w:lang w:val="ar_AE" w:bidi="ar_AE"/>
@@ -1747,7 +1670,6 @@
       </w:r>
       <w:r>
         <w:rPr>
-          <w:b/>
           <w:rtl/>
           <w:cs/>
           <w:lang w:val="ar_AE" w:bidi="ar_AE"/>
@@ -1762,20 +1684,14 @@
         </w:rPr>
         <w:t xml:space="preserve">. </w:t>
       </w:r>
-      <w:hyperlink r:id="rId13">
-        <w:r>
-          <w:rPr>
-            <w:rtl/>
-            <w:cs/>
-            <w:lang w:val="ar_AE" w:bidi="ar_AE"/>
-          </w:rPr>
-          <w:rPr>
-            <w:color w:val="0000EE"/>
-            <w:u w:val="single"/>
-          </w:rPr>
-          <w:t>وإبراهيم</w:t>
-        </w:r>
-      </w:hyperlink>
+      <w:r>
+        <w:rPr>
+          <w:rtl/>
+          <w:cs/>
+          <w:lang w:val="ar_AE" w:bidi="ar_AE"/>
+        </w:rPr>
+        <w:t>وإبراهيم</w:t>
+      </w:r>
       <w:r>
         <w:rPr>
           <w:rtl/>
@@ -1784,20 +1700,14 @@
         </w:rPr>
         <w:t xml:space="preserve">، جد يعقوب، كان رجلًا قد عاش قبل ميلاد يسوع بنحو ألفي عام. وعندما كان إبراهيم في الخامسة والسبعين من العمر، تحدث الله إليه. وأمره الله أن يترك أرضه، وأن يذهب إلى المكان الذي سيريه الله. وقال الله إنه سيبارك إبراهيم، وأنه سيجعل منه </w:t>
       </w:r>
-      <w:hyperlink r:id="rId24">
-        <w:r>
-          <w:rPr>
-            <w:rtl/>
-            <w:cs/>
-            <w:lang w:val="ar_AE" w:bidi="ar_AE"/>
-          </w:rPr>
-          <w:rPr>
-            <w:color w:val="0000EE"/>
-            <w:u w:val="single"/>
-          </w:rPr>
-          <w:t>أمة</w:t>
-        </w:r>
-      </w:hyperlink>
+      <w:r>
+        <w:rPr>
+          <w:rtl/>
+          <w:cs/>
+          <w:lang w:val="ar_AE" w:bidi="ar_AE"/>
+        </w:rPr>
+        <w:t>أمة</w:t>
+      </w:r>
       <w:r>
         <w:rPr>
           <w:rtl/>
@@ -1806,20 +1716,14 @@
         </w:rPr>
         <w:t xml:space="preserve"> عظيمة، وأنه </w:t>
       </w:r>
-      <w:hyperlink r:id="rId25">
-        <w:r>
-          <w:rPr>
-            <w:rtl/>
-            <w:cs/>
-            <w:lang w:val="ar_AE" w:bidi="ar_AE"/>
-          </w:rPr>
-          <w:rPr>
-            <w:color w:val="0000EE"/>
-            <w:u w:val="single"/>
-          </w:rPr>
-          <w:t>سيبارك</w:t>
-        </w:r>
-      </w:hyperlink>
+      <w:r>
+        <w:rPr>
+          <w:rtl/>
+          <w:cs/>
+          <w:lang w:val="ar_AE" w:bidi="ar_AE"/>
+        </w:rPr>
+        <w:t>سيبارك</w:t>
+      </w:r>
       <w:r>
         <w:rPr>
           <w:rtl/>
@@ -1828,20 +1732,14 @@
         </w:rPr>
         <w:t xml:space="preserve"> جميع أمم العالم من خلال إبراهيم. وقد أطاع إبراهيم الله وقاده الله إلى المنطقة التي كانت في ذلك الوقت تُدعى </w:t>
       </w:r>
-      <w:hyperlink r:id="rId26">
-        <w:r>
-          <w:rPr>
-            <w:rtl/>
-            <w:cs/>
-            <w:lang w:val="ar_AE" w:bidi="ar_AE"/>
-          </w:rPr>
-          <w:rPr>
-            <w:color w:val="0000EE"/>
-            <w:u w:val="single"/>
-          </w:rPr>
-          <w:t>كنعان</w:t>
-        </w:r>
-      </w:hyperlink>
+      <w:r>
+        <w:rPr>
+          <w:rtl/>
+          <w:cs/>
+          <w:lang w:val="ar_AE" w:bidi="ar_AE"/>
+        </w:rPr>
+        <w:t>كنعان</w:t>
+      </w:r>
       <w:r>
         <w:rPr>
           <w:rtl/>
@@ -1890,20 +1788,14 @@
         </w:rPr>
         <w:t xml:space="preserve">ولأن الله كان قد قطع وعدًا مع إبراهيم، ثم مع إسحاق ويعقوب، فإن بنو إسرائيل كانوا شعب الله الخاص. وقد قطع الله معهم </w:t>
       </w:r>
-      <w:hyperlink r:id="rId27">
-        <w:r>
-          <w:rPr>
-            <w:rtl/>
-            <w:cs/>
-            <w:lang w:val="ar_AE" w:bidi="ar_AE"/>
-          </w:rPr>
-          <w:rPr>
-            <w:color w:val="0000EE"/>
-            <w:u w:val="single"/>
-          </w:rPr>
-          <w:t>عهدًا</w:t>
-        </w:r>
-      </w:hyperlink>
+      <w:r>
+        <w:rPr>
+          <w:rtl/>
+          <w:cs/>
+          <w:lang w:val="ar_AE" w:bidi="ar_AE"/>
+        </w:rPr>
+        <w:t>عهدًا</w:t>
+      </w:r>
       <w:r>
         <w:rPr>
           <w:rtl/>
@@ -1914,7 +1806,6 @@
       </w:r>
       <w:r>
         <w:rPr>
-          <w:b/>
           <w:rtl/>
           <w:cs/>
           <w:lang w:val="ar_AE" w:bidi="ar_AE"/>
@@ -1949,20 +1840,14 @@
         </w:rPr>
         <w:t xml:space="preserve">والأرض التي كان بنو إسرائيل يسكنون فيها كانت تدعى </w:t>
       </w:r>
-      <w:hyperlink r:id="rId14">
-        <w:r>
-          <w:rPr>
-            <w:rtl/>
-            <w:cs/>
-            <w:lang w:val="ar_AE" w:bidi="ar_AE"/>
-          </w:rPr>
-          <w:rPr>
-            <w:color w:val="0000EE"/>
-            <w:u w:val="single"/>
-          </w:rPr>
-          <w:t>إسرائيل</w:t>
-        </w:r>
-      </w:hyperlink>
+      <w:r>
+        <w:rPr>
+          <w:rtl/>
+          <w:cs/>
+          <w:lang w:val="ar_AE" w:bidi="ar_AE"/>
+        </w:rPr>
+        <w:t>إسرائيل</w:t>
+      </w:r>
       <w:r>
         <w:rPr>
           <w:rtl/>
@@ -1971,20 +1856,14 @@
         </w:rPr>
         <w:t xml:space="preserve">. وقد قُسمت هذه الأرض بين أسباط إسرائيل المختلفة. في البداية، كان الناس الذين يحكمون بني إسرائيل يُدعون "القضاة". وعندما طلب الشعب من الله أن يعطيهم </w:t>
       </w:r>
-      <w:hyperlink r:id="rId28">
-        <w:r>
-          <w:rPr>
-            <w:rtl/>
-            <w:cs/>
-            <w:lang w:val="ar_AE" w:bidi="ar_AE"/>
-          </w:rPr>
-          <w:rPr>
-            <w:color w:val="0000EE"/>
-            <w:u w:val="single"/>
-          </w:rPr>
-          <w:t>ملكًا</w:t>
-        </w:r>
-      </w:hyperlink>
+      <w:r>
+        <w:rPr>
+          <w:rtl/>
+          <w:cs/>
+          <w:lang w:val="ar_AE" w:bidi="ar_AE"/>
+        </w:rPr>
+        <w:t>ملكًا</w:t>
+      </w:r>
       <w:r>
         <w:rPr>
           <w:rtl/>
@@ -1993,20 +1872,14 @@
         </w:rPr>
         <w:t xml:space="preserve">، عيَّن الله ملكًا ليحكمهم. ولقد سار ذلك بشكل جيد في البداية، فتحت حكم الملك </w:t>
       </w:r>
-      <w:hyperlink r:id="rId29">
-        <w:r>
-          <w:rPr>
-            <w:rtl/>
-            <w:cs/>
-            <w:lang w:val="ar_AE" w:bidi="ar_AE"/>
-          </w:rPr>
-          <w:rPr>
-            <w:color w:val="0000EE"/>
-            <w:u w:val="single"/>
-          </w:rPr>
-          <w:t>داود</w:t>
-        </w:r>
-      </w:hyperlink>
+      <w:r>
+        <w:rPr>
+          <w:rtl/>
+          <w:cs/>
+          <w:lang w:val="ar_AE" w:bidi="ar_AE"/>
+        </w:rPr>
+        <w:t>داود</w:t>
+      </w:r>
       <w:r>
         <w:rPr>
           <w:rtl/>
@@ -2037,7 +1910,6 @@
       </w:r>
       <w:r>
         <w:rPr>
-          <w:b/>
           <w:rtl/>
           <w:cs/>
           <w:lang w:val="ar_AE" w:bidi="ar_AE"/>
@@ -2052,20 +1924,14 @@
         </w:rPr>
         <w:t xml:space="preserve">. وقد سميت يهوذا لأن سبط يهوذا كان الأكبر من بين السبطين اللذين شكلا معًا هذه </w:t>
       </w:r>
-      <w:hyperlink r:id="rId30">
-        <w:r>
-          <w:rPr>
-            <w:rtl/>
-            <w:cs/>
-            <w:lang w:val="ar_AE" w:bidi="ar_AE"/>
-          </w:rPr>
-          <w:rPr>
-            <w:color w:val="0000EE"/>
-            <w:u w:val="single"/>
-          </w:rPr>
-          <w:t>المملكة</w:t>
-        </w:r>
-      </w:hyperlink>
+      <w:r>
+        <w:rPr>
+          <w:rtl/>
+          <w:cs/>
+          <w:lang w:val="ar_AE" w:bidi="ar_AE"/>
+        </w:rPr>
+        <w:t>المملكة</w:t>
+      </w:r>
       <w:r>
         <w:rPr>
           <w:rtl/>
@@ -2094,20 +1960,14 @@
         </w:rPr>
         <w:t xml:space="preserve">وكل جزء (مملكة) كان له ملكه الخاص به. وقد هزمت </w:t>
       </w:r>
-      <w:hyperlink r:id="rId24">
-        <w:r>
-          <w:rPr>
-            <w:rtl/>
-            <w:cs/>
-            <w:lang w:val="ar_AE" w:bidi="ar_AE"/>
-          </w:rPr>
-          <w:rPr>
-            <w:color w:val="0000EE"/>
-            <w:u w:val="single"/>
-          </w:rPr>
-          <w:t>أمة</w:t>
-        </w:r>
-      </w:hyperlink>
+      <w:r>
+        <w:rPr>
+          <w:rtl/>
+          <w:cs/>
+          <w:lang w:val="ar_AE" w:bidi="ar_AE"/>
+        </w:rPr>
+        <w:t>أمة</w:t>
+      </w:r>
       <w:r>
         <w:rPr>
           <w:rtl/>
@@ -2136,20 +1996,14 @@
         </w:rPr>
         <w:t xml:space="preserve">وقد استمرت مملكة يهوذا لفترة أطول قليلًا، لكن بعد بضع سنوات عاقبهم الله أيضًا على عصيانهم. وقد جاءت أمة أجنبية أخرى، هم البابليون، ودمَّرت مدينة </w:t>
       </w:r>
-      <w:hyperlink r:id="rId31">
-        <w:r>
-          <w:rPr>
-            <w:rtl/>
-            <w:cs/>
-            <w:lang w:val="ar_AE" w:bidi="ar_AE"/>
-          </w:rPr>
-          <w:rPr>
-            <w:color w:val="0000EE"/>
-            <w:u w:val="single"/>
-          </w:rPr>
-          <w:t>أورشليم</w:t>
-        </w:r>
-      </w:hyperlink>
+      <w:r>
+        <w:rPr>
+          <w:rtl/>
+          <w:cs/>
+          <w:lang w:val="ar_AE" w:bidi="ar_AE"/>
+        </w:rPr>
+        <w:t>أورشليم</w:t>
+      </w:r>
       <w:r>
         <w:rPr>
           <w:rtl/>
@@ -2160,7 +2014,6 @@
       </w:r>
       <w:r>
         <w:rPr>
-          <w:b/>
           <w:rtl/>
           <w:cs/>
           <w:lang w:val="ar_AE" w:bidi="ar_AE"/>
@@ -2175,20 +2028,14 @@
         </w:rPr>
         <w:t xml:space="preserve">، وهو ما يعني "الشعب الذي من يهوذا". ولاحقًا، سمح الله لليهود بأن يعودوا إلى يهوذا، حيث أعادوا بناء مدينة أورشليم وبناء </w:t>
       </w:r>
-      <w:hyperlink r:id="rId18">
-        <w:r>
-          <w:rPr>
-            <w:rtl/>
-            <w:cs/>
-            <w:lang w:val="ar_AE" w:bidi="ar_AE"/>
-          </w:rPr>
-          <w:rPr>
-            <w:color w:val="0000EE"/>
-            <w:u w:val="single"/>
-          </w:rPr>
-          <w:t>الهيكل</w:t>
-        </w:r>
-      </w:hyperlink>
+      <w:r>
+        <w:rPr>
+          <w:rtl/>
+          <w:cs/>
+          <w:lang w:val="ar_AE" w:bidi="ar_AE"/>
+        </w:rPr>
+        <w:t>الهيكل</w:t>
+      </w:r>
       <w:r>
         <w:rPr>
           <w:rtl/>
@@ -2197,20 +2044,14 @@
         </w:rPr>
         <w:t xml:space="preserve">. لكن يهوذا لم تعد مملكة مستقلة مرة أخرى. وفي زمن العهد الجديد، كانت أمة أخرى تدعى روما تسود على المنطقة التي كانت سابقًا إسرائيل. وما كان في السابق مملكة يهوذا الجنوبية، صار يُدعى الآن مقاطعة </w:t>
       </w:r>
-      <w:hyperlink r:id="rId32">
-        <w:r>
-          <w:rPr>
-            <w:rtl/>
-            <w:cs/>
-            <w:lang w:val="ar_AE" w:bidi="ar_AE"/>
-          </w:rPr>
-          <w:rPr>
-            <w:color w:val="0000EE"/>
-            <w:u w:val="single"/>
-          </w:rPr>
-          <w:t>اليهودية</w:t>
-        </w:r>
-      </w:hyperlink>
+      <w:r>
+        <w:rPr>
+          <w:rtl/>
+          <w:cs/>
+          <w:lang w:val="ar_AE" w:bidi="ar_AE"/>
+        </w:rPr>
+        <w:t>اليهودية</w:t>
+      </w:r>
       <w:r>
         <w:rPr>
           <w:rtl/>
@@ -2219,20 +2060,14 @@
         </w:rPr>
         <w:t xml:space="preserve"> الرومانية. وما كان في السابق مملكة إسرائيل الشمالية، صار الآن تقريبًا مقاطعتي </w:t>
       </w:r>
-      <w:hyperlink r:id="rId33">
-        <w:r>
-          <w:rPr>
-            <w:rtl/>
-            <w:cs/>
-            <w:lang w:val="ar_AE" w:bidi="ar_AE"/>
-          </w:rPr>
-          <w:rPr>
-            <w:color w:val="0000EE"/>
-            <w:u w:val="single"/>
-          </w:rPr>
-          <w:t>السامرة</w:t>
-        </w:r>
-      </w:hyperlink>
+      <w:r>
+        <w:rPr>
+          <w:rtl/>
+          <w:cs/>
+          <w:lang w:val="ar_AE" w:bidi="ar_AE"/>
+        </w:rPr>
+        <w:t>السامرة</w:t>
+      </w:r>
       <w:r>
         <w:rPr>
           <w:rtl/>
@@ -2241,20 +2076,14 @@
         </w:rPr>
         <w:t xml:space="preserve"> </w:t>
       </w:r>
-      <w:hyperlink r:id="rId21">
-        <w:r>
-          <w:rPr>
-            <w:rtl/>
-            <w:cs/>
-            <w:lang w:val="ar_AE" w:bidi="ar_AE"/>
-          </w:rPr>
-          <w:rPr>
-            <w:color w:val="0000EE"/>
-            <w:u w:val="single"/>
-          </w:rPr>
-          <w:t>والجليل</w:t>
-        </w:r>
-      </w:hyperlink>
+      <w:r>
+        <w:rPr>
+          <w:rtl/>
+          <w:cs/>
+          <w:lang w:val="ar_AE" w:bidi="ar_AE"/>
+        </w:rPr>
+        <w:t>والجليل</w:t>
+      </w:r>
       <w:r>
         <w:rPr>
           <w:rtl/>
@@ -2349,50 +2178,43 @@
       </w:r>
       <w:r>
         <w:rPr>
+          <w:rtl/>
+          <w:cs/>
+          <w:lang w:val="ar_AE" w:bidi="ar_AE"/>
+        </w:rPr>
+        <w:t>لبني إسرائيل</w:t>
+      </w:r>
+      <w:r>
+        <w:rPr>
+          <w:rtl/>
+          <w:cs/>
+          <w:lang w:val="ar_AE" w:bidi="ar_AE"/>
+        </w:rPr>
+        <w:t xml:space="preserve"> أنه سيسكن بينهم وسيقابلهم في الخيمة المحمولة الخاصة التي أعدّوها له. وقد دعا بنو إسرائيل هذه الخيمة </w:t>
+      </w:r>
+      <w:r>
+        <w:rPr>
+          <w:rtl/>
+          <w:cs/>
+          <w:lang w:val="ar_AE" w:bidi="ar_AE"/>
+        </w:rPr>
+        <w:t>خيمة الاجتماع</w:t>
+      </w:r>
+      <w:r>
+        <w:rPr>
+          <w:rtl/>
+          <w:cs/>
+          <w:lang w:val="ar_AE" w:bidi="ar_AE"/>
+        </w:rPr>
+        <w:t xml:space="preserve">. ولاحقًا، عندما استقر بنو إسرائيل في </w:t>
+      </w:r>
+      <w:r>
+        <w:rPr>
           <w:b/>
           <w:rtl/>
           <w:cs/>
           <w:lang w:val="ar_AE" w:bidi="ar_AE"/>
         </w:rPr>
-        <w:t>لبني إسرائيل</w:t>
-      </w:r>
-      <w:r>
-        <w:rPr>
-          <w:rtl/>
-          <w:cs/>
-          <w:lang w:val="ar_AE" w:bidi="ar_AE"/>
-        </w:rPr>
-        <w:t xml:space="preserve"> أنه سيسكن بينهم وسيقابلهم في الخيمة المحمولة الخاصة التي أعدّوها له. وقد دعا بنو إسرائيل هذه الخيمة </w:t>
-      </w:r>
-      <w:hyperlink r:id="rId34">
-        <w:r>
-          <w:rPr>
-            <w:rtl/>
-            <w:cs/>
-            <w:lang w:val="ar_AE" w:bidi="ar_AE"/>
-          </w:rPr>
-          <w:rPr>
-            <w:color w:val="0000EE"/>
-            <w:u w:val="single"/>
-          </w:rPr>
-          <w:t>خيمة الاجتماع</w:t>
-        </w:r>
-      </w:hyperlink>
-      <w:r>
-        <w:rPr>
-          <w:rtl/>
-          <w:cs/>
-          <w:lang w:val="ar_AE" w:bidi="ar_AE"/>
-        </w:rPr>
-        <w:t xml:space="preserve">. ولاحقًا، عندما استقر بنو إسرائيل في </w:t>
-      </w:r>
-      <w:r>
-        <w:rPr>
-          <w:b/>
-          <w:rtl/>
-          <w:cs/>
-          <w:lang w:val="ar_AE" w:bidi="ar_AE"/>
-        </w:rPr>
         <w:t>أرض الموعد</w:t>
       </w:r>
       <w:r>
@@ -2403,20 +2225,14 @@
         </w:rPr>
         <w:t xml:space="preserve">، أعطاهم الله تعليمات خاصة ببناء بيت أكثر استمرارية وثباتًا من أجله – أي </w:t>
       </w:r>
-      <w:hyperlink r:id="rId18">
-        <w:r>
-          <w:rPr>
-            <w:rtl/>
-            <w:cs/>
-            <w:lang w:val="ar_AE" w:bidi="ar_AE"/>
-          </w:rPr>
-          <w:rPr>
-            <w:color w:val="0000EE"/>
-            <w:u w:val="single"/>
-          </w:rPr>
-          <w:t>الهيكل</w:t>
-        </w:r>
-      </w:hyperlink>
+      <w:r>
+        <w:rPr>
+          <w:rtl/>
+          <w:cs/>
+          <w:lang w:val="ar_AE" w:bidi="ar_AE"/>
+        </w:rPr>
+        <w:t>الهيكل</w:t>
+      </w:r>
       <w:r>
         <w:rPr>
           <w:rtl/>
@@ -2427,7 +2243,6 @@
       </w:r>
       <w:r>
         <w:rPr>
-          <w:b/>
           <w:rtl/>
           <w:cs/>
           <w:lang w:val="ar_AE" w:bidi="ar_AE"/>
@@ -2526,20 +2341,14 @@
         </w:rPr>
         <w:t xml:space="preserve"> لا يشير إلى بناء، بل إلى الأشخاص الذين ينتمون إلى داود. وكان </w:t>
       </w:r>
-      <w:hyperlink r:id="rId29">
-        <w:r>
-          <w:rPr>
-            <w:rtl/>
-            <w:cs/>
-            <w:lang w:val="ar_AE" w:bidi="ar_AE"/>
-          </w:rPr>
-          <w:rPr>
-            <w:color w:val="0000EE"/>
-            <w:u w:val="single"/>
-          </w:rPr>
-          <w:t>داود</w:t>
-        </w:r>
-      </w:hyperlink>
+      <w:r>
+        <w:rPr>
+          <w:rtl/>
+          <w:cs/>
+          <w:lang w:val="ar_AE" w:bidi="ar_AE"/>
+        </w:rPr>
+        <w:t>داود</w:t>
+      </w:r>
       <w:r>
         <w:rPr>
           <w:rtl/>
@@ -2548,20 +2357,14 @@
         </w:rPr>
         <w:t xml:space="preserve"> ملكًا مهمًا في تاريخ </w:t>
       </w:r>
-      <w:hyperlink r:id="rId14">
-        <w:r>
-          <w:rPr>
-            <w:rtl/>
-            <w:cs/>
-            <w:lang w:val="ar_AE" w:bidi="ar_AE"/>
-          </w:rPr>
-          <w:rPr>
-            <w:color w:val="0000EE"/>
-            <w:u w:val="single"/>
-          </w:rPr>
-          <w:t>إسرائيل</w:t>
-        </w:r>
-      </w:hyperlink>
+      <w:r>
+        <w:rPr>
+          <w:rtl/>
+          <w:cs/>
+          <w:lang w:val="ar_AE" w:bidi="ar_AE"/>
+        </w:rPr>
+        <w:t>إسرائيل</w:t>
+      </w:r>
       <w:r>
         <w:rPr>
           <w:rtl/>
@@ -2612,7 +2415,6 @@
       </w:r>
       <w:r>
         <w:rPr>
-          <w:b/>
           <w:rtl/>
           <w:cs/>
           <w:lang w:val="ar_AE" w:bidi="ar_AE"/>
@@ -2627,20 +2429,14 @@
         </w:rPr>
         <w:t xml:space="preserve"> داود. فعندما أراد داود أن يبني </w:t>
       </w:r>
-      <w:hyperlink r:id="rId18">
-        <w:r>
-          <w:rPr>
-            <w:rtl/>
-            <w:cs/>
-            <w:lang w:val="ar_AE" w:bidi="ar_AE"/>
-          </w:rPr>
-          <w:rPr>
-            <w:color w:val="0000EE"/>
-            <w:u w:val="single"/>
-          </w:rPr>
-          <w:t>هيكلًا</w:t>
-        </w:r>
-      </w:hyperlink>
+      <w:r>
+        <w:rPr>
+          <w:rtl/>
+          <w:cs/>
+          <w:lang w:val="ar_AE" w:bidi="ar_AE"/>
+        </w:rPr>
+        <w:t>هيكلًا</w:t>
+      </w:r>
       <w:r>
         <w:rPr>
           <w:rtl/>
@@ -2649,20 +2445,14 @@
         </w:rPr>
         <w:t xml:space="preserve"> - بيتًا - لله، قال له الله: "أنت لن تبني لي بيتًا. بل أنا الذي أبني لك بيتًا!" وهذا يعني أن الله كان سيعطي داود نسلًا كثيرًا، وأنه دائمًا سيكون واحدًا منهم </w:t>
       </w:r>
-      <w:hyperlink r:id="rId28">
-        <w:r>
-          <w:rPr>
-            <w:rtl/>
-            <w:cs/>
-            <w:lang w:val="ar_AE" w:bidi="ar_AE"/>
-          </w:rPr>
-          <w:rPr>
-            <w:color w:val="0000EE"/>
-            <w:u w:val="single"/>
-          </w:rPr>
-          <w:t>ملكًا</w:t>
-        </w:r>
-      </w:hyperlink>
+      <w:r>
+        <w:rPr>
+          <w:rtl/>
+          <w:cs/>
+          <w:lang w:val="ar_AE" w:bidi="ar_AE"/>
+        </w:rPr>
+        <w:t>ملكًا</w:t>
+      </w:r>
       <w:r>
         <w:rPr>
           <w:rtl/>
@@ -2693,7 +2483,6 @@
       </w:r>
       <w:r>
         <w:rPr>
-          <w:b/>
           <w:rtl/>
           <w:cs/>
           <w:lang w:val="ar_AE" w:bidi="ar_AE"/>
@@ -2708,20 +2497,14 @@
         </w:rPr>
         <w:t xml:space="preserve">، أن </w:t>
       </w:r>
-      <w:hyperlink r:id="rId35">
-        <w:r>
-          <w:rPr>
-            <w:rtl/>
-            <w:cs/>
-            <w:lang w:val="ar_AE" w:bidi="ar_AE"/>
-          </w:rPr>
-          <w:rPr>
-            <w:color w:val="0000EE"/>
-            <w:u w:val="single"/>
-          </w:rPr>
-          <w:t>المسيَّا</w:t>
-        </w:r>
-      </w:hyperlink>
+      <w:r>
+        <w:rPr>
+          <w:rtl/>
+          <w:cs/>
+          <w:lang w:val="ar_AE" w:bidi="ar_AE"/>
+        </w:rPr>
+        <w:t>المسيَّا</w:t>
+      </w:r>
       <w:r>
         <w:rPr>
           <w:rtl/>
@@ -2730,20 +2513,14 @@
         </w:rPr>
         <w:t xml:space="preserve">، الملك </w:t>
       </w:r>
-      <w:hyperlink r:id="rId36">
-        <w:r>
-          <w:rPr>
-            <w:rtl/>
-            <w:cs/>
-            <w:lang w:val="ar_AE" w:bidi="ar_AE"/>
-          </w:rPr>
-          <w:rPr>
-            <w:color w:val="0000EE"/>
-            <w:u w:val="single"/>
-          </w:rPr>
-          <w:t>والمخلِّص</w:t>
-        </w:r>
-      </w:hyperlink>
+      <w:r>
+        <w:rPr>
+          <w:rtl/>
+          <w:cs/>
+          <w:lang w:val="ar_AE" w:bidi="ar_AE"/>
+        </w:rPr>
+        <w:t>والمخلِّص</w:t>
+      </w:r>
       <w:r>
         <w:rPr>
           <w:rtl/>
@@ -2828,20 +2605,14 @@
         </w:rPr>
         <w:t xml:space="preserve"> هي قرية (بلدة) في مقاطعة </w:t>
       </w:r>
-      <w:hyperlink r:id="rId21">
-        <w:r>
-          <w:rPr>
-            <w:rtl/>
-            <w:cs/>
-            <w:lang w:val="ar_AE" w:bidi="ar_AE"/>
-          </w:rPr>
-          <w:rPr>
-            <w:color w:val="0000EE"/>
-            <w:u w:val="single"/>
-          </w:rPr>
-          <w:t>الجليل</w:t>
-        </w:r>
-      </w:hyperlink>
+      <w:r>
+        <w:rPr>
+          <w:rtl/>
+          <w:cs/>
+          <w:lang w:val="ar_AE" w:bidi="ar_AE"/>
+        </w:rPr>
+        <w:t>الجليل</w:t>
+      </w:r>
       <w:r>
         <w:rPr>
           <w:rtl/>
@@ -2850,20 +2621,14 @@
         </w:rPr>
         <w:t xml:space="preserve">. وكانت على الأرجح قريبة من مدينة </w:t>
       </w:r>
-      <w:hyperlink r:id="rId37">
-        <w:r>
-          <w:rPr>
-            <w:rtl/>
-            <w:cs/>
-            <w:lang w:val="ar_AE" w:bidi="ar_AE"/>
-          </w:rPr>
-          <w:rPr>
-            <w:color w:val="0000EE"/>
-            <w:u w:val="single"/>
-          </w:rPr>
-          <w:t>كفرناحوم</w:t>
-        </w:r>
-      </w:hyperlink>
+      <w:r>
+        <w:rPr>
+          <w:rtl/>
+          <w:cs/>
+          <w:lang w:val="ar_AE" w:bidi="ar_AE"/>
+        </w:rPr>
+        <w:t>كفرناحوم</w:t>
+      </w:r>
       <w:r>
         <w:rPr>
           <w:rtl/>
@@ -2872,20 +2637,14 @@
         </w:rPr>
         <w:t xml:space="preserve">، لأن </w:t>
       </w:r>
-      <w:hyperlink r:id="rId38">
-        <w:r>
-          <w:rPr>
-            <w:rtl/>
-            <w:cs/>
-            <w:lang w:val="ar_AE" w:bidi="ar_AE"/>
-          </w:rPr>
-          <w:rPr>
-            <w:color w:val="0000EE"/>
-            <w:u w:val="single"/>
-          </w:rPr>
-          <w:t>يوحنا</w:t>
-        </w:r>
-      </w:hyperlink>
+      <w:r>
+        <w:rPr>
+          <w:rtl/>
+          <w:cs/>
+          <w:lang w:val="ar_AE" w:bidi="ar_AE"/>
+        </w:rPr>
+        <w:t>يوحنا</w:t>
+      </w:r>
       <w:r>
         <w:rPr>
           <w:rtl/>
@@ -2896,7 +2655,6 @@
       </w:r>
       <w:r>
         <w:rPr>
-          <w:b/>
           <w:rtl/>
           <w:cs/>
           <w:lang w:val="ar_AE" w:bidi="ar_AE"/>
@@ -2911,20 +2669,14 @@
         </w:rPr>
         <w:t xml:space="preserve"> يسوع أندراوس وبطرس جاءا من بيت صيدا، لكن مرقس يخبرنا أنهم عاشوا في كفرناحوم. والقرية كانت قريبة من </w:t>
       </w:r>
-      <w:hyperlink r:id="rId39">
-        <w:r>
-          <w:rPr>
-            <w:rtl/>
-            <w:cs/>
-            <w:lang w:val="ar_AE" w:bidi="ar_AE"/>
-          </w:rPr>
-          <w:rPr>
-            <w:color w:val="0000EE"/>
-            <w:u w:val="single"/>
-          </w:rPr>
-          <w:t>بحر الجليل</w:t>
-        </w:r>
-      </w:hyperlink>
+      <w:r>
+        <w:rPr>
+          <w:rtl/>
+          <w:cs/>
+          <w:lang w:val="ar_AE" w:bidi="ar_AE"/>
+        </w:rPr>
+        <w:t>بحر الجليل</w:t>
+      </w:r>
       <w:r>
         <w:rPr>
           <w:rtl/>
@@ -3029,20 +2781,14 @@
         </w:rPr>
         <w:t xml:space="preserve">كانت بيت لحم قرية صغيرة في </w:t>
       </w:r>
-      <w:hyperlink r:id="rId14">
-        <w:r>
-          <w:rPr>
-            <w:rtl/>
-            <w:cs/>
-            <w:lang w:val="ar_AE" w:bidi="ar_AE"/>
-          </w:rPr>
-          <w:rPr>
-            <w:color w:val="0000EE"/>
-            <w:u w:val="single"/>
-          </w:rPr>
-          <w:t>إسرائيل</w:t>
-        </w:r>
-      </w:hyperlink>
+      <w:r>
+        <w:rPr>
+          <w:rtl/>
+          <w:cs/>
+          <w:lang w:val="ar_AE" w:bidi="ar_AE"/>
+        </w:rPr>
+        <w:t>إسرائيل</w:t>
+      </w:r>
       <w:r>
         <w:rPr>
           <w:rtl/>
@@ -3051,20 +2797,14 @@
         </w:rPr>
         <w:t xml:space="preserve">. واسم بيت لحم يعني "بيت الخبز". في العهد القديم، كانت الأحداث الواردة في سفر راعوث قد وقعت في بيت لحم كانت راعوث امرأة موآبية، لذلك فهي ليست </w:t>
       </w:r>
-      <w:hyperlink r:id="rId40">
-        <w:r>
-          <w:rPr>
-            <w:rtl/>
-            <w:cs/>
-            <w:lang w:val="ar_AE" w:bidi="ar_AE"/>
-          </w:rPr>
-          <w:rPr>
-            <w:color w:val="0000EE"/>
-            <w:u w:val="single"/>
-          </w:rPr>
-          <w:t>إسرائيلية</w:t>
-        </w:r>
-      </w:hyperlink>
+      <w:r>
+        <w:rPr>
+          <w:rtl/>
+          <w:cs/>
+          <w:lang w:val="ar_AE" w:bidi="ar_AE"/>
+        </w:rPr>
+        <w:t>إسرائيلية</w:t>
+      </w:r>
       <w:r>
         <w:rPr>
           <w:rtl/>
@@ -3073,20 +2813,14 @@
         </w:rPr>
         <w:t xml:space="preserve">. وقد مات زوج راعوث الأول، لذلك فقد جاءت راعوث لتعيش في بيت لحم مع حماتها الإسرائيلية. ولاحقًا، تزوجت راعوث من رجل إسرائيلي من بيت لحم. كان </w:t>
       </w:r>
-      <w:hyperlink r:id="rId29">
-        <w:r>
-          <w:rPr>
-            <w:rtl/>
-            <w:cs/>
-            <w:lang w:val="ar_AE" w:bidi="ar_AE"/>
-          </w:rPr>
-          <w:rPr>
-            <w:color w:val="0000EE"/>
-            <w:u w:val="single"/>
-          </w:rPr>
-          <w:t>داود</w:t>
-        </w:r>
-      </w:hyperlink>
+      <w:r>
+        <w:rPr>
+          <w:rtl/>
+          <w:cs/>
+          <w:lang w:val="ar_AE" w:bidi="ar_AE"/>
+        </w:rPr>
+        <w:t>داود</w:t>
+      </w:r>
       <w:r>
         <w:rPr>
           <w:rtl/>
@@ -3135,20 +2869,14 @@
         </w:rPr>
         <w:t xml:space="preserve">وقد قال الله لاحقًا من خلال </w:t>
       </w:r>
-      <w:hyperlink r:id="rId41">
-        <w:r>
-          <w:rPr>
-            <w:rtl/>
-            <w:cs/>
-            <w:lang w:val="ar_AE" w:bidi="ar_AE"/>
-          </w:rPr>
-          <w:rPr>
-            <w:color w:val="0000EE"/>
-            <w:u w:val="single"/>
-          </w:rPr>
-          <w:t>النبي</w:t>
-        </w:r>
-      </w:hyperlink>
+      <w:r>
+        <w:rPr>
+          <w:rtl/>
+          <w:cs/>
+          <w:lang w:val="ar_AE" w:bidi="ar_AE"/>
+        </w:rPr>
+        <w:t>النبي</w:t>
+      </w:r>
       <w:r>
         <w:rPr>
           <w:rtl/>
@@ -3159,7 +2887,6 @@
       </w:r>
       <w:r>
         <w:rPr>
-          <w:b/>
           <w:rtl/>
           <w:cs/>
           <w:lang w:val="ar_AE" w:bidi="ar_AE"/>
@@ -3174,20 +2901,14 @@
         </w:rPr>
         <w:t xml:space="preserve"> كانوا يتوقَّعون أن </w:t>
       </w:r>
-      <w:hyperlink r:id="rId35">
-        <w:r>
-          <w:rPr>
-            <w:rtl/>
-            <w:cs/>
-            <w:lang w:val="ar_AE" w:bidi="ar_AE"/>
-          </w:rPr>
-          <w:rPr>
-            <w:color w:val="0000EE"/>
-            <w:u w:val="single"/>
-          </w:rPr>
-          <w:t>المسيَّا</w:t>
-        </w:r>
-      </w:hyperlink>
+      <w:r>
+        <w:rPr>
+          <w:rtl/>
+          <w:cs/>
+          <w:lang w:val="ar_AE" w:bidi="ar_AE"/>
+        </w:rPr>
+        <w:t>المسيَّا</w:t>
+      </w:r>
       <w:r>
         <w:rPr>
           <w:rtl/>
@@ -3196,20 +2917,14 @@
         </w:rPr>
         <w:t>، الملك و</w:t>
       </w:r>
-      <w:hyperlink r:id="rId36">
-        <w:r>
-          <w:rPr>
-            <w:rtl/>
-            <w:cs/>
-            <w:lang w:val="ar_AE" w:bidi="ar_AE"/>
-          </w:rPr>
-          <w:rPr>
-            <w:color w:val="0000EE"/>
-            <w:u w:val="single"/>
-          </w:rPr>
-          <w:t>المخلّص</w:t>
-        </w:r>
-      </w:hyperlink>
+      <w:r>
+        <w:rPr>
+          <w:rtl/>
+          <w:cs/>
+          <w:lang w:val="ar_AE" w:bidi="ar_AE"/>
+        </w:rPr>
+        <w:t>المخلّص</w:t>
+      </w:r>
       <w:r>
         <w:rPr>
           <w:rtl/>
@@ -3258,20 +2973,14 @@
         </w:rPr>
         <w:t xml:space="preserve">وكانت بيت لحم تبعد بضعة كيلومترات عن </w:t>
       </w:r>
-      <w:hyperlink r:id="rId31">
-        <w:r>
-          <w:rPr>
-            <w:rtl/>
-            <w:cs/>
-            <w:lang w:val="ar_AE" w:bidi="ar_AE"/>
-          </w:rPr>
-          <w:rPr>
-            <w:color w:val="0000EE"/>
-            <w:u w:val="single"/>
-          </w:rPr>
-          <w:t>أورشليم</w:t>
-        </w:r>
-      </w:hyperlink>
+      <w:r>
+        <w:rPr>
+          <w:rtl/>
+          <w:cs/>
+          <w:lang w:val="ar_AE" w:bidi="ar_AE"/>
+        </w:rPr>
+        <w:t>أورشليم</w:t>
+      </w:r>
       <w:r>
         <w:rPr>
           <w:rtl/>

</xml_diff>